<commit_message>
added form ui better
</commit_message>
<xml_diff>
--- a/frontend/public/form.docx
+++ b/frontend/public/form.docx
@@ -236,15 +236,7 @@
           <w:sz w:val="24"/>
           <w:szCs w:val="36"/>
         </w:rPr>
-        <w:t>……</w:t>
-      </w:r>
-      <w:proofErr w:type="gramStart"/>
-      <w:r>
-        <w:rPr>
-          <w:sz w:val="24"/>
-          <w:szCs w:val="36"/>
-        </w:rPr>
-        <w:t>…</w:t>
+        <w:t>………</w:t>
       </w:r>
       <w:r>
         <w:rPr>
@@ -253,7 +245,6 @@
         </w:rPr>
         <w:t>..</w:t>
       </w:r>
-      <w:proofErr w:type="gramEnd"/>
       <w:r>
         <w:rPr>
           <w:sz w:val="24"/>
@@ -340,17 +331,8 @@
           <w:sz w:val="24"/>
           <w:szCs w:val="36"/>
         </w:rPr>
-        <w:t>………………………………………………………</w:t>
-      </w:r>
-      <w:proofErr w:type="gramStart"/>
-      <w:r>
-        <w:rPr>
-          <w:sz w:val="24"/>
-          <w:szCs w:val="36"/>
-        </w:rPr>
-        <w:t>…..</w:t>
-      </w:r>
-      <w:proofErr w:type="gramEnd"/>
+        <w:t>…………………………………………………………..…………..</w:t>
+      </w:r>
       <w:r>
         <w:rPr>
           <w:sz w:val="24"/>
@@ -358,15 +340,57 @@
         </w:rPr>
         <w:t>………</w:t>
       </w:r>
-      <w:proofErr w:type="gramStart"/>
-      <w:r>
-        <w:rPr>
-          <w:sz w:val="24"/>
-          <w:szCs w:val="36"/>
-        </w:rPr>
-        <w:t>…..</w:t>
-      </w:r>
-      <w:proofErr w:type="gramEnd"/>
+      <w:r>
+        <w:rPr>
+          <w:sz w:val="24"/>
+          <w:szCs w:val="36"/>
+        </w:rPr>
+        <w:t>.</w:t>
+      </w:r>
+      <w:r>
+        <w:rPr>
+          <w:sz w:val="24"/>
+          <w:szCs w:val="36"/>
+        </w:rPr>
+        <w:t>……….</w:t>
+      </w:r>
+    </w:p>
+    <w:p>
+      <w:pPr>
+        <w:jc w:val="both"/>
+        <w:rPr>
+          <w:sz w:val="24"/>
+          <w:szCs w:val="36"/>
+        </w:rPr>
+      </w:pPr>
+      <w:r>
+        <w:rPr>
+          <w:sz w:val="24"/>
+          <w:szCs w:val="36"/>
+        </w:rPr>
+        <w:t>P. S. …………………………………………………</w:t>
+      </w:r>
+      <w:r>
+        <w:rPr>
+          <w:sz w:val="24"/>
+          <w:szCs w:val="36"/>
+        </w:rPr>
+        <w:t>………………………………………..</w:t>
+      </w:r>
+      <w:r>
+        <w:rPr>
+          <w:sz w:val="24"/>
+          <w:szCs w:val="36"/>
+        </w:rPr>
+        <w:t>……Dist……………</w:t>
+      </w:r>
+      <w:r>
+        <w:rPr>
+          <w:sz w:val="24"/>
+          <w:szCs w:val="36"/>
+        </w:rPr>
+        <w:t>……….……………………..</w:t>
+      </w:r>
       <w:r>
         <w:rPr>
           <w:sz w:val="24"/>
@@ -379,14 +403,14 @@
           <w:sz w:val="24"/>
           <w:szCs w:val="36"/>
         </w:rPr>
-        <w:t>.</w:t>
-      </w:r>
-      <w:r>
-        <w:rPr>
-          <w:sz w:val="24"/>
-          <w:szCs w:val="36"/>
-        </w:rPr>
-        <w:t>……….</w:t>
+        <w:t>..</w:t>
+      </w:r>
+      <w:r>
+        <w:rPr>
+          <w:sz w:val="24"/>
+          <w:szCs w:val="36"/>
+        </w:rPr>
+        <w:t>…….</w:t>
       </w:r>
     </w:p>
     <w:p>
@@ -402,118 +426,8 @@
           <w:sz w:val="24"/>
           <w:szCs w:val="36"/>
         </w:rPr>
-        <w:t>P. S. …………………………………………………</w:t>
-      </w:r>
-      <w:r>
-        <w:rPr>
-          <w:sz w:val="24"/>
-          <w:szCs w:val="36"/>
-        </w:rPr>
-        <w:t>……………………………………</w:t>
-      </w:r>
-      <w:proofErr w:type="gramStart"/>
-      <w:r>
-        <w:rPr>
-          <w:sz w:val="24"/>
-          <w:szCs w:val="36"/>
-        </w:rPr>
-        <w:t>…..</w:t>
-      </w:r>
-      <w:proofErr w:type="gramEnd"/>
-      <w:r>
-        <w:rPr>
-          <w:sz w:val="24"/>
-          <w:szCs w:val="36"/>
-        </w:rPr>
-        <w:t>……Dist……………</w:t>
-      </w:r>
-      <w:r>
-        <w:rPr>
-          <w:sz w:val="24"/>
-          <w:szCs w:val="36"/>
-        </w:rPr>
-        <w:t>……….…………………</w:t>
-      </w:r>
-      <w:proofErr w:type="gramStart"/>
-      <w:r>
-        <w:rPr>
-          <w:sz w:val="24"/>
-          <w:szCs w:val="36"/>
-        </w:rPr>
-        <w:t>…..</w:t>
-      </w:r>
-      <w:proofErr w:type="gramEnd"/>
-      <w:r>
-        <w:rPr>
-          <w:sz w:val="24"/>
-          <w:szCs w:val="36"/>
-        </w:rPr>
-        <w:t>……</w:t>
-      </w:r>
-      <w:proofErr w:type="gramStart"/>
-      <w:r>
-        <w:rPr>
-          <w:sz w:val="24"/>
-          <w:szCs w:val="36"/>
-        </w:rPr>
-        <w:t>…</w:t>
-      </w:r>
-      <w:r>
-        <w:rPr>
-          <w:sz w:val="24"/>
-          <w:szCs w:val="36"/>
-        </w:rPr>
-        <w:t>..</w:t>
-      </w:r>
-      <w:proofErr w:type="gramEnd"/>
-      <w:r>
-        <w:rPr>
-          <w:sz w:val="24"/>
-          <w:szCs w:val="36"/>
-        </w:rPr>
-        <w:t>…….</w:t>
-      </w:r>
-    </w:p>
-    <w:p>
-      <w:pPr>
-        <w:jc w:val="both"/>
-        <w:rPr>
-          <w:sz w:val="24"/>
-          <w:szCs w:val="36"/>
-        </w:rPr>
-      </w:pPr>
-      <w:r>
-        <w:rPr>
-          <w:sz w:val="24"/>
-          <w:szCs w:val="36"/>
-        </w:rPr>
-        <w:t xml:space="preserve">Do </w:t>
-      </w:r>
-      <w:proofErr w:type="spellStart"/>
-      <w:r>
-        <w:rPr>
-          <w:sz w:val="24"/>
-          <w:szCs w:val="36"/>
-        </w:rPr>
-        <w:t>hareby</w:t>
-      </w:r>
-      <w:proofErr w:type="spellEnd"/>
-      <w:r>
-        <w:rPr>
-          <w:sz w:val="24"/>
-          <w:szCs w:val="36"/>
-        </w:rPr>
-        <w:t xml:space="preserve"> solemnly affirm and declare a </w:t>
-      </w:r>
-      <w:proofErr w:type="spellStart"/>
-      <w:r>
-        <w:rPr>
-          <w:sz w:val="24"/>
-          <w:szCs w:val="36"/>
-        </w:rPr>
-        <w:t>follws</w:t>
-      </w:r>
-      <w:proofErr w:type="spellEnd"/>
+        <w:t>Do hareby solemnly affirm and declare a follws</w:t>
+      </w:r>
       <w:r>
         <w:rPr>
           <w:sz w:val="24"/>
@@ -557,7 +471,6 @@
         </w:rPr>
         <w:t>……………………………………………………………</w:t>
       </w:r>
-      <w:proofErr w:type="gramStart"/>
       <w:r>
         <w:rPr>
           <w:sz w:val="24"/>
@@ -579,7 +492,6 @@
         </w:rPr>
         <w:t>…..</w:t>
       </w:r>
-      <w:proofErr w:type="gramEnd"/>
       <w:r>
         <w:rPr>
           <w:sz w:val="24"/>
@@ -597,21 +509,12 @@
           <w:szCs w:val="36"/>
         </w:rPr>
       </w:pPr>
-      <w:proofErr w:type="spellStart"/>
-      <w:r>
-        <w:rPr>
-          <w:sz w:val="24"/>
-          <w:szCs w:val="36"/>
-        </w:rPr>
-        <w:t>Boaring</w:t>
-      </w:r>
-      <w:proofErr w:type="spellEnd"/>
-      <w:r>
-        <w:rPr>
-          <w:sz w:val="24"/>
-          <w:szCs w:val="36"/>
-        </w:rPr>
-        <w:t xml:space="preserve"> registration No. ……………………………………………………</w:t>
+      <w:r>
+        <w:rPr>
+          <w:sz w:val="24"/>
+          <w:szCs w:val="36"/>
+        </w:rPr>
+        <w:t>Boaring registration No. ……………………………………………………</w:t>
       </w:r>
       <w:r>
         <w:rPr>
@@ -686,7 +589,6 @@
         </w:rPr>
         <w:t>.</w:t>
       </w:r>
-      <w:proofErr w:type="gramStart"/>
       <w:r>
         <w:rPr>
           <w:sz w:val="24"/>
@@ -715,7 +617,6 @@
         </w:rPr>
         <w:t>…..</w:t>
       </w:r>
-      <w:proofErr w:type="gramEnd"/>
     </w:p>
     <w:p>
       <w:pPr>
@@ -754,7 +655,6 @@
         </w:rPr>
         <w:t>…</w:t>
       </w:r>
-      <w:proofErr w:type="gramStart"/>
       <w:r>
         <w:rPr>
           <w:sz w:val="24"/>
@@ -769,7 +669,6 @@
         </w:rPr>
         <w:t>..</w:t>
       </w:r>
-      <w:proofErr w:type="gramEnd"/>
       <w:r>
         <w:rPr>
           <w:sz w:val="24"/>
@@ -947,7 +846,6 @@
         </w:rPr>
         <w:t>……</w:t>
       </w:r>
-      <w:proofErr w:type="gramStart"/>
       <w:r>
         <w:rPr>
           <w:sz w:val="24"/>
@@ -955,7 +853,6 @@
         </w:rPr>
         <w:t>…..</w:t>
       </w:r>
-      <w:proofErr w:type="gramEnd"/>
       <w:r>
         <w:rPr>
           <w:sz w:val="24"/>
@@ -1006,17 +903,8 @@
           <w:sz w:val="24"/>
           <w:szCs w:val="36"/>
         </w:rPr>
-        <w:t>………</w:t>
-      </w:r>
-      <w:proofErr w:type="gramStart"/>
-      <w:r>
-        <w:rPr>
-          <w:sz w:val="24"/>
-          <w:szCs w:val="36"/>
-        </w:rPr>
-        <w:t>…..</w:t>
-      </w:r>
-      <w:proofErr w:type="gramEnd"/>
+        <w:t>…………..</w:t>
+      </w:r>
       <w:r>
         <w:rPr>
           <w:sz w:val="24"/>
@@ -1046,17 +934,8 @@
           <w:sz w:val="24"/>
           <w:szCs w:val="36"/>
         </w:rPr>
-        <w:t>………………………………</w:t>
-      </w:r>
-      <w:proofErr w:type="gramStart"/>
-      <w:r>
-        <w:rPr>
-          <w:sz w:val="24"/>
-          <w:szCs w:val="36"/>
-        </w:rPr>
-        <w:t>…..</w:t>
-      </w:r>
-      <w:proofErr w:type="gramEnd"/>
+        <w:t>…………………………………..</w:t>
+      </w:r>
       <w:r>
         <w:rPr>
           <w:sz w:val="24"/>
@@ -1140,39 +1019,7 @@
           <w:szCs w:val="36"/>
         </w:rPr>
         <w:tab/>
-        <w:t xml:space="preserve">That the ownership of the </w:t>
-      </w:r>
-      <w:proofErr w:type="spellStart"/>
-      <w:r>
-        <w:rPr>
-          <w:sz w:val="24"/>
-          <w:szCs w:val="36"/>
-        </w:rPr>
-        <w:t>vehiche</w:t>
-      </w:r>
-      <w:proofErr w:type="spellEnd"/>
-      <w:r>
-        <w:rPr>
-          <w:sz w:val="24"/>
-          <w:szCs w:val="36"/>
-        </w:rPr>
-        <w:t xml:space="preserve"> aforesaid may be </w:t>
-      </w:r>
-      <w:proofErr w:type="spellStart"/>
-      <w:r>
-        <w:rPr>
-          <w:sz w:val="24"/>
-          <w:szCs w:val="36"/>
-        </w:rPr>
-        <w:t>transforred</w:t>
-      </w:r>
-      <w:proofErr w:type="spellEnd"/>
-      <w:r>
-        <w:rPr>
-          <w:sz w:val="24"/>
-          <w:szCs w:val="36"/>
-        </w:rPr>
-        <w:t xml:space="preserve"> in the name of the purchaser above named for which I have got to objection, hence this affidavit.</w:t>
+        <w:t>That the ownership of the vehiche aforesaid may be transforred in the name of the purchaser above named for which I have got to objection, hence this affidavit.</w:t>
       </w:r>
     </w:p>
     <w:p>
@@ -1191,23 +1038,7 @@
           <w:szCs w:val="36"/>
         </w:rPr>
         <w:tab/>
-        <w:t xml:space="preserve">That the above content of this affidavit </w:t>
-      </w:r>
-      <w:proofErr w:type="gramStart"/>
-      <w:r>
-        <w:rPr>
-          <w:sz w:val="24"/>
-          <w:szCs w:val="36"/>
-        </w:rPr>
-        <w:t>are</w:t>
-      </w:r>
-      <w:proofErr w:type="gramEnd"/>
-      <w:r>
-        <w:rPr>
-          <w:sz w:val="24"/>
-          <w:szCs w:val="36"/>
-        </w:rPr>
-        <w:t xml:space="preserve"> true and correct to the best of my knowledge and belief.</w:t>
+        <w:t>That the above content of this affidavit are true and correct to the best of my knowledge and belief.</w:t>
       </w:r>
     </w:p>
     <w:p>
@@ -1292,17 +1123,8 @@
           <w:sz w:val="24"/>
           <w:szCs w:val="36"/>
         </w:rPr>
-        <w:t xml:space="preserve">     </w:t>
-      </w:r>
-      <w:proofErr w:type="spellStart"/>
-      <w:r>
-        <w:rPr>
-          <w:sz w:val="24"/>
-          <w:szCs w:val="36"/>
-        </w:rPr>
-        <w:t>DEPONENT</w:t>
-      </w:r>
-      <w:proofErr w:type="spellEnd"/>
+        <w:t xml:space="preserve">     DEPONENT</w:t>
+      </w:r>
     </w:p>
     <w:p>
       <w:pPr>
@@ -1624,17 +1446,8 @@
           <w:sz w:val="24"/>
           <w:szCs w:val="36"/>
         </w:rPr>
-        <w:t>……………………………</w:t>
-      </w:r>
-      <w:proofErr w:type="gramStart"/>
-      <w:r>
-        <w:rPr>
-          <w:sz w:val="24"/>
-          <w:szCs w:val="36"/>
-        </w:rPr>
-        <w:t>…..</w:t>
-      </w:r>
-      <w:proofErr w:type="gramEnd"/>
+        <w:t>………………………………..</w:t>
+      </w:r>
       <w:r>
         <w:rPr>
           <w:sz w:val="24"/>
@@ -1647,17 +1460,8 @@
           <w:sz w:val="24"/>
           <w:szCs w:val="36"/>
         </w:rPr>
-        <w:t>………………</w:t>
-      </w:r>
-      <w:proofErr w:type="gramStart"/>
-      <w:r>
-        <w:rPr>
-          <w:sz w:val="24"/>
-          <w:szCs w:val="36"/>
-        </w:rPr>
-        <w:t>…..</w:t>
-      </w:r>
-      <w:proofErr w:type="gramEnd"/>
+        <w:t>…………………..</w:t>
+      </w:r>
       <w:r>
         <w:rPr>
           <w:sz w:val="24"/>
@@ -1687,31 +1491,14 @@
           <w:sz w:val="24"/>
           <w:szCs w:val="36"/>
         </w:rPr>
-        <w:t>……………………………</w:t>
-      </w:r>
-      <w:proofErr w:type="gramStart"/>
-      <w:r>
-        <w:rPr>
-          <w:sz w:val="24"/>
-          <w:szCs w:val="36"/>
-        </w:rPr>
-        <w:t>…..</w:t>
-      </w:r>
-      <w:proofErr w:type="gramEnd"/>
-      <w:r>
-        <w:rPr>
-          <w:sz w:val="24"/>
-          <w:szCs w:val="36"/>
-        </w:rPr>
-        <w:t>…</w:t>
-      </w:r>
-      <w:proofErr w:type="gramStart"/>
-      <w:r>
-        <w:rPr>
-          <w:sz w:val="24"/>
-          <w:szCs w:val="36"/>
-        </w:rPr>
-        <w:t>….</w:t>
+        <w:t>………………………………..</w:t>
+      </w:r>
+      <w:r>
+        <w:rPr>
+          <w:sz w:val="24"/>
+          <w:szCs w:val="36"/>
+        </w:rPr>
+        <w:t>…….</w:t>
       </w:r>
       <w:r>
         <w:rPr>
@@ -1725,15 +1512,7 @@
           <w:sz w:val="24"/>
           <w:szCs w:val="36"/>
         </w:rPr>
-        <w:t>O.</w:t>
-      </w:r>
-      <w:proofErr w:type="gramEnd"/>
-      <w:r>
-        <w:rPr>
-          <w:sz w:val="24"/>
-          <w:szCs w:val="36"/>
-        </w:rPr>
-        <w:t xml:space="preserve"> …………</w:t>
+        <w:t>O. …………</w:t>
       </w:r>
       <w:r>
         <w:rPr>
@@ -1792,17 +1571,8 @@
           <w:sz w:val="24"/>
           <w:szCs w:val="36"/>
         </w:rPr>
-        <w:t>………………</w:t>
-      </w:r>
-      <w:proofErr w:type="gramStart"/>
-      <w:r>
-        <w:rPr>
-          <w:sz w:val="24"/>
-          <w:szCs w:val="36"/>
-        </w:rPr>
-        <w:t>…..</w:t>
-      </w:r>
-      <w:proofErr w:type="gramEnd"/>
+        <w:t>…………………..</w:t>
+      </w:r>
     </w:p>
     <w:p>
       <w:pPr>
@@ -1818,23 +1588,7 @@
           <w:sz w:val="24"/>
           <w:szCs w:val="36"/>
         </w:rPr>
-        <w:t xml:space="preserve">do hereby solemnly affirm and declare as </w:t>
-      </w:r>
-      <w:proofErr w:type="gramStart"/>
-      <w:r>
-        <w:rPr>
-          <w:sz w:val="24"/>
-          <w:szCs w:val="36"/>
-        </w:rPr>
-        <w:t>follow :</w:t>
-      </w:r>
-      <w:proofErr w:type="gramEnd"/>
-      <w:r>
-        <w:rPr>
-          <w:sz w:val="24"/>
-          <w:szCs w:val="36"/>
-        </w:rPr>
-        <w:t xml:space="preserve">- </w:t>
+        <w:t xml:space="preserve">do hereby solemnly affirm and declare as follow :- </w:t>
       </w:r>
     </w:p>
     <w:p>
@@ -1904,33 +1658,15 @@
           <w:sz w:val="24"/>
           <w:szCs w:val="36"/>
         </w:rPr>
-        <w:t>…………………………………………………</w:t>
-      </w:r>
-      <w:proofErr w:type="gramStart"/>
-      <w:r>
-        <w:rPr>
-          <w:sz w:val="24"/>
-          <w:szCs w:val="36"/>
-        </w:rPr>
-        <w:t>…..</w:t>
-      </w:r>
-      <w:proofErr w:type="gramEnd"/>
-      <w:r>
-        <w:rPr>
-          <w:sz w:val="24"/>
-          <w:szCs w:val="36"/>
-        </w:rPr>
-        <w:t>…………………………………………</w:t>
-      </w:r>
-      <w:proofErr w:type="gramStart"/>
-      <w:r>
-        <w:rPr>
-          <w:sz w:val="24"/>
-          <w:szCs w:val="36"/>
-        </w:rPr>
-        <w:t>…..</w:t>
-      </w:r>
-      <w:proofErr w:type="gramEnd"/>
+        <w:t>……………………………………………………..</w:t>
+      </w:r>
+      <w:r>
+        <w:rPr>
+          <w:sz w:val="24"/>
+          <w:szCs w:val="36"/>
+        </w:rPr>
+        <w:t>……………………………………………..</w:t>
+      </w:r>
     </w:p>
     <w:p>
       <w:pPr>
@@ -1941,38 +1677,20 @@
           <w:szCs w:val="36"/>
         </w:rPr>
       </w:pPr>
-      <w:proofErr w:type="gramStart"/>
-      <w:r>
-        <w:rPr>
-          <w:sz w:val="24"/>
-          <w:szCs w:val="36"/>
-        </w:rPr>
-        <w:t>Engine  No.</w:t>
-      </w:r>
-      <w:proofErr w:type="gramEnd"/>
-      <w:r>
-        <w:rPr>
-          <w:sz w:val="24"/>
-          <w:szCs w:val="36"/>
-        </w:rPr>
-        <w:t xml:space="preserve"> …………………………………</w:t>
-      </w:r>
-      <w:r>
-        <w:rPr>
-          <w:sz w:val="24"/>
-          <w:szCs w:val="36"/>
-        </w:rPr>
-        <w:t>…………………………</w:t>
-      </w:r>
-      <w:proofErr w:type="gramStart"/>
-      <w:r>
-        <w:rPr>
-          <w:sz w:val="24"/>
-          <w:szCs w:val="36"/>
-        </w:rPr>
-        <w:t>…..</w:t>
-      </w:r>
-      <w:proofErr w:type="gramEnd"/>
+      <w:r>
+        <w:rPr>
+          <w:sz w:val="24"/>
+          <w:szCs w:val="36"/>
+        </w:rPr>
+        <w:t>Engine  No. …………………………………</w:t>
+      </w:r>
+      <w:r>
+        <w:rPr>
+          <w:sz w:val="24"/>
+          <w:szCs w:val="36"/>
+        </w:rPr>
+        <w:t>……………………………..</w:t>
+      </w:r>
       <w:r>
         <w:rPr>
           <w:sz w:val="24"/>
@@ -1980,7 +1698,6 @@
         </w:rPr>
         <w:t>……</w:t>
       </w:r>
-      <w:proofErr w:type="gramStart"/>
       <w:r>
         <w:rPr>
           <w:sz w:val="24"/>
@@ -1993,32 +1710,15 @@
           <w:sz w:val="24"/>
           <w:szCs w:val="36"/>
         </w:rPr>
-        <w:t>.</w:t>
-      </w:r>
-      <w:proofErr w:type="gramEnd"/>
-      <w:r>
-        <w:rPr>
-          <w:sz w:val="24"/>
-          <w:szCs w:val="36"/>
-        </w:rPr>
-        <w:t xml:space="preserve"> Chassis No. ………………</w:t>
-      </w:r>
-      <w:r>
-        <w:rPr>
-          <w:sz w:val="24"/>
-          <w:szCs w:val="36"/>
-        </w:rPr>
-        <w:t>…………………</w:t>
-      </w:r>
-      <w:proofErr w:type="gramStart"/>
-      <w:r>
-        <w:rPr>
-          <w:sz w:val="24"/>
-          <w:szCs w:val="36"/>
-        </w:rPr>
-        <w:t>…..</w:t>
-      </w:r>
-      <w:proofErr w:type="gramEnd"/>
+        <w:t>. Chassis No. ………………</w:t>
+      </w:r>
+      <w:r>
+        <w:rPr>
+          <w:sz w:val="24"/>
+          <w:szCs w:val="36"/>
+        </w:rPr>
+        <w:t>……………………..</w:t>
+      </w:r>
       <w:r>
         <w:rPr>
           <w:sz w:val="24"/>
@@ -2062,15 +1762,7 @@
           <w:sz w:val="24"/>
           <w:szCs w:val="36"/>
         </w:rPr>
-        <w:t>………………</w:t>
-      </w:r>
-      <w:proofErr w:type="gramStart"/>
-      <w:r>
-        <w:rPr>
-          <w:sz w:val="24"/>
-          <w:szCs w:val="36"/>
-        </w:rPr>
-        <w:t>….</w:t>
+        <w:t>………………….</w:t>
       </w:r>
       <w:r>
         <w:rPr>
@@ -2079,7 +1771,6 @@
         </w:rPr>
         <w:t>.</w:t>
       </w:r>
-      <w:proofErr w:type="gramEnd"/>
     </w:p>
     <w:p>
       <w:pPr>
@@ -2185,30 +1876,14 @@
           <w:sz w:val="24"/>
           <w:szCs w:val="36"/>
         </w:rPr>
-        <w:t>………………………</w:t>
-      </w:r>
-      <w:proofErr w:type="gramStart"/>
-      <w:r>
-        <w:rPr>
-          <w:sz w:val="24"/>
-          <w:szCs w:val="36"/>
-        </w:rPr>
-        <w:t>….….</w:t>
-      </w:r>
-      <w:r>
-        <w:rPr>
-          <w:sz w:val="24"/>
-          <w:szCs w:val="36"/>
-        </w:rPr>
-        <w:t>.</w:t>
-      </w:r>
-      <w:proofErr w:type="gramEnd"/>
-      <w:r>
-        <w:rPr>
-          <w:sz w:val="24"/>
-          <w:szCs w:val="36"/>
-        </w:rPr>
-        <w:t xml:space="preserve"> District ……………</w:t>
+        <w:t>………………………….….</w:t>
+      </w:r>
+      <w:r>
+        <w:rPr>
+          <w:sz w:val="24"/>
+          <w:szCs w:val="36"/>
+        </w:rPr>
+        <w:t>. District ……………</w:t>
       </w:r>
       <w:r>
         <w:rPr>
@@ -2222,17 +1897,8 @@
           <w:sz w:val="24"/>
           <w:szCs w:val="36"/>
         </w:rPr>
-        <w:t>……………</w:t>
-      </w:r>
-      <w:proofErr w:type="gramStart"/>
-      <w:r>
-        <w:rPr>
-          <w:sz w:val="24"/>
-          <w:szCs w:val="36"/>
-        </w:rPr>
-        <w:t>…..</w:t>
-      </w:r>
-      <w:proofErr w:type="gramEnd"/>
+        <w:t>………………..</w:t>
+      </w:r>
     </w:p>
     <w:p>
       <w:pPr>
@@ -2256,23 +1922,7 @@
           <w:szCs w:val="36"/>
         </w:rPr>
         <w:tab/>
-        <w:t xml:space="preserve">That neither any case not Govt. dues </w:t>
-      </w:r>
-      <w:proofErr w:type="gramStart"/>
-      <w:r>
-        <w:rPr>
-          <w:sz w:val="24"/>
-          <w:szCs w:val="36"/>
-        </w:rPr>
-        <w:t>stands</w:t>
-      </w:r>
-      <w:proofErr w:type="gramEnd"/>
-      <w:r>
-        <w:rPr>
-          <w:sz w:val="24"/>
-          <w:szCs w:val="36"/>
-        </w:rPr>
-        <w:t xml:space="preserve"> </w:t>
+        <w:t xml:space="preserve">That neither any case not Govt. dues stands </w:t>
       </w:r>
       <w:r>
         <w:rPr>
@@ -2304,39 +1954,7 @@
           <w:szCs w:val="36"/>
         </w:rPr>
         <w:tab/>
-        <w:t xml:space="preserve">That the ownership of the aforesaid vehicle may be </w:t>
-      </w:r>
-      <w:proofErr w:type="spellStart"/>
-      <w:r>
-        <w:rPr>
-          <w:sz w:val="24"/>
-          <w:szCs w:val="36"/>
-        </w:rPr>
-        <w:t>transfered</w:t>
-      </w:r>
-      <w:proofErr w:type="spellEnd"/>
-      <w:r>
-        <w:rPr>
-          <w:sz w:val="24"/>
-          <w:szCs w:val="36"/>
-        </w:rPr>
-        <w:t xml:space="preserve"> in the name of the </w:t>
-      </w:r>
-      <w:proofErr w:type="spellStart"/>
-      <w:r>
-        <w:rPr>
-          <w:sz w:val="24"/>
-          <w:szCs w:val="36"/>
-        </w:rPr>
-        <w:t>purchager</w:t>
-      </w:r>
-      <w:proofErr w:type="spellEnd"/>
-      <w:r>
-        <w:rPr>
-          <w:sz w:val="24"/>
-          <w:szCs w:val="36"/>
-        </w:rPr>
-        <w:t xml:space="preserve"> for which I have got no objection hence this affidavit.</w:t>
+        <w:t>That the ownership of the aforesaid vehicle may be transfered in the name of the purchager for which I have got no objection hence this affidavit.</w:t>
       </w:r>
     </w:p>
     <w:p>
@@ -2494,15 +2112,7 @@
         <w:t>…….</w:t>
       </w:r>
       <w:r>
-        <w:t>…………</w:t>
-      </w:r>
-      <w:proofErr w:type="gramStart"/>
-      <w:r>
-        <w:t>….(</w:t>
-      </w:r>
-      <w:proofErr w:type="gramEnd"/>
-      <w:r>
-        <w:t>in whose jurisdiction the Transferee resides)</w:t>
+        <w:t>…………….(in whose jurisdiction the Transferee resides)</w:t>
       </w:r>
     </w:p>
     <w:p>
@@ -2513,27 +2123,14 @@
         <w:jc w:val="both"/>
       </w:pPr>
       <w:r>
-        <w:t>I/We………………………………………………………………</w:t>
-      </w:r>
-      <w:proofErr w:type="gramStart"/>
-      <w:r>
-        <w:t>….…..</w:t>
-      </w:r>
-      <w:proofErr w:type="gramEnd"/>
-      <w:r>
-        <w:t>resident of…………………</w:t>
+        <w:t>I/We………………………………………………………………….…..resident of…………………</w:t>
       </w:r>
       <w:r>
         <w:t>…………</w:t>
       </w:r>
       <w:r>
-        <w:t>…</w:t>
-      </w:r>
-      <w:proofErr w:type="gramStart"/>
-      <w:r>
-        <w:t>…..</w:t>
-      </w:r>
-      <w:proofErr w:type="gramEnd"/>
+        <w:t>……..</w:t>
+      </w:r>
     </w:p>
     <w:p>
       <w:pPr>
@@ -2561,15 +2158,7 @@
         <w:t xml:space="preserve">…..   </w:t>
       </w:r>
       <w:r>
-        <w:t>have on the…………………</w:t>
-      </w:r>
-      <w:proofErr w:type="gramStart"/>
-      <w:r>
-        <w:t>…..</w:t>
-      </w:r>
-      <w:proofErr w:type="gramEnd"/>
-      <w:r>
-        <w:t xml:space="preserve">day </w:t>
+        <w:t xml:space="preserve">have on the……………………..day </w:t>
       </w:r>
       <w:r>
         <w:rPr>
@@ -2614,16 +2203,8 @@
         <w:rPr>
           <w:spacing w:val="-3"/>
         </w:rPr>
-        <w:t>……………………………….…</w:t>
-      </w:r>
-      <w:proofErr w:type="gramStart"/>
-      <w:r>
-        <w:rPr>
-          <w:spacing w:val="-3"/>
-        </w:rPr>
-        <w:t>…..</w:t>
-      </w:r>
-      <w:proofErr w:type="gramEnd"/>
+        <w:t>……………………………….……..</w:t>
+      </w:r>
     </w:p>
     <w:p>
       <w:pPr>
@@ -2642,21 +2223,7 @@
         <w:rPr>
           <w:spacing w:val="-3"/>
         </w:rPr>
-        <w:t>No……………………………………………………</w:t>
-      </w:r>
-      <w:proofErr w:type="gramStart"/>
-      <w:r>
-        <w:rPr>
-          <w:spacing w:val="-3"/>
-        </w:rPr>
-        <w:t>….[</w:t>
-      </w:r>
-      <w:proofErr w:type="gramEnd"/>
-      <w:r>
-        <w:rPr>
-          <w:spacing w:val="-3"/>
-        </w:rPr>
-        <w:t xml:space="preserve">Engine number or motor </w:t>
+        <w:t xml:space="preserve">No……………………………………………………….[Engine number or motor </w:t>
       </w:r>
       <w:r>
         <w:rPr>
@@ -2673,7 +2240,6 @@
         </w:rPr>
         <w:t xml:space="preserve">of </w:t>
       </w:r>
-      <w:proofErr w:type="gramStart"/>
       <w:r>
         <w:t xml:space="preserve">Battery   </w:t>
       </w:r>
@@ -2684,11 +2250,7 @@
         <w:t xml:space="preserve"> </w:t>
       </w:r>
       <w:r>
-        <w:t>Operated</w:t>
-      </w:r>
-      <w:proofErr w:type="gramEnd"/>
-      <w:r>
-        <w:t xml:space="preserve">   </w:t>
+        <w:t xml:space="preserve">Operated   </w:t>
       </w:r>
       <w:r>
         <w:rPr>
@@ -2696,14 +2258,12 @@
         </w:rPr>
         <w:t xml:space="preserve"> </w:t>
       </w:r>
-      <w:proofErr w:type="gramStart"/>
       <w:r>
         <w:rPr>
           <w:spacing w:val="-3"/>
         </w:rPr>
         <w:t>Vehicles]…</w:t>
       </w:r>
-      <w:proofErr w:type="gramEnd"/>
       <w:r>
         <w:rPr>
           <w:spacing w:val="-3"/>
@@ -2751,14 +2311,12 @@
         </w:rPr>
         <w:t xml:space="preserve"> </w:t>
       </w:r>
-      <w:proofErr w:type="spellStart"/>
       <w:r>
         <w:rPr>
           <w:spacing w:val="-6"/>
         </w:rPr>
         <w:t>Smt</w:t>
       </w:r>
-      <w:proofErr w:type="spellEnd"/>
       <w:r>
         <w:rPr>
           <w:spacing w:val="-6"/>
@@ -2813,28 +2371,7 @@
         <w:rPr>
           <w:spacing w:val="-3"/>
         </w:rPr>
-        <w:t>……………………</w:t>
-      </w:r>
-      <w:proofErr w:type="gramStart"/>
-      <w:r>
-        <w:rPr>
-          <w:spacing w:val="-3"/>
-        </w:rPr>
-        <w:t>…..</w:t>
-      </w:r>
-      <w:proofErr w:type="gramEnd"/>
-      <w:r>
-        <w:rPr>
-          <w:spacing w:val="-3"/>
-        </w:rPr>
-        <w:t xml:space="preserve">    </w:t>
-      </w:r>
-      <w:proofErr w:type="gramStart"/>
-      <w:r>
-        <w:rPr>
-          <w:spacing w:val="-3"/>
-        </w:rPr>
-        <w:t xml:space="preserve">residing </w:t>
+        <w:t xml:space="preserve">………………………..    residing </w:t>
       </w:r>
       <w:r>
         <w:rPr>
@@ -2845,7 +2382,6 @@
       <w:r>
         <w:t>at</w:t>
       </w:r>
-      <w:proofErr w:type="gramEnd"/>
     </w:p>
     <w:p>
       <w:pPr>
@@ -2946,15 +2482,7 @@
         <w:t xml:space="preserve">is </w:t>
       </w:r>
       <w:r>
-        <w:t xml:space="preserve">not </w:t>
-      </w:r>
-      <w:proofErr w:type="spellStart"/>
-      <w:r>
-        <w:t>superdari</w:t>
-      </w:r>
-      <w:proofErr w:type="spellEnd"/>
-      <w:r>
-        <w:t xml:space="preserve"> </w:t>
+        <w:t xml:space="preserve">not superdari </w:t>
       </w:r>
       <w:r>
         <w:rPr>
@@ -2969,24 +2497,13 @@
         <w:t xml:space="preserve">free </w:t>
       </w:r>
       <w:r>
-        <w:t xml:space="preserve">from </w:t>
-      </w:r>
-      <w:proofErr w:type="gramStart"/>
-      <w:r>
-        <w:t xml:space="preserve">all  </w:t>
-      </w:r>
-      <w:r>
-        <w:rPr>
-          <w:spacing w:val="-3"/>
-        </w:rPr>
-        <w:t>encumbrances</w:t>
-      </w:r>
-      <w:proofErr w:type="gramEnd"/>
-      <w:r>
-        <w:rPr>
-          <w:spacing w:val="-3"/>
-        </w:rPr>
-        <w:t xml:space="preserve">  </w:t>
+        <w:t xml:space="preserve">from all  </w:t>
+      </w:r>
+      <w:r>
+        <w:rPr>
+          <w:spacing w:val="-3"/>
+        </w:rPr>
+        <w:t xml:space="preserve">encumbrances  </w:t>
       </w:r>
       <w:r>
         <w:t xml:space="preserve">and information furnished is true. </w:t>
@@ -3224,16 +2741,8 @@
         <w:rPr>
           <w:spacing w:val="-3"/>
         </w:rPr>
-        <w:t>Date……………………………</w:t>
-      </w:r>
-      <w:proofErr w:type="gramStart"/>
-      <w:r>
-        <w:rPr>
-          <w:spacing w:val="-3"/>
-        </w:rPr>
-        <w:t>…..</w:t>
-      </w:r>
-      <w:proofErr w:type="gramEnd"/>
+        <w:t>Date………………………………..</w:t>
+      </w:r>
     </w:p>
     <w:p>
       <w:pPr>
@@ -3299,13 +2808,8 @@
         <w:tab/>
       </w:r>
       <w:r>
-        <w:t>……</w:t>
-      </w:r>
-      <w:proofErr w:type="gramStart"/>
-      <w:r>
-        <w:t>…..</w:t>
-      </w:r>
-      <w:proofErr w:type="gramEnd"/>
+        <w:t>………..</w:t>
+      </w:r>
       <w:r>
         <w:t>in whose jurisdiction</w:t>
       </w:r>
@@ -3360,13 +2864,8 @@
         <w:pStyle w:val="BodyText"/>
         <w:spacing w:before="121"/>
       </w:pPr>
-      <w:proofErr w:type="spellStart"/>
-      <w:r>
-        <w:t>Ref.No</w:t>
-      </w:r>
-      <w:proofErr w:type="spellEnd"/>
-      <w:r>
-        <w:t>……………………………</w:t>
+      <w:r>
+        <w:t>Ref.No……………………………</w:t>
       </w:r>
       <w:r>
         <w:t>……….</w:t>
@@ -3375,24 +2874,11 @@
         <w:t>……. Office of the……………………</w:t>
       </w:r>
       <w:r>
-        <w:t>……</w:t>
-      </w:r>
-      <w:proofErr w:type="gramStart"/>
-      <w:r>
-        <w:t>…..</w:t>
-      </w:r>
-      <w:proofErr w:type="gramEnd"/>
-      <w:r>
-        <w:t>…</w:t>
-      </w:r>
-      <w:r>
-        <w:t>……………………………</w:t>
-      </w:r>
-      <w:proofErr w:type="gramStart"/>
-      <w:r>
-        <w:t>…..</w:t>
-      </w:r>
-      <w:proofErr w:type="gramEnd"/>
+        <w:t>………..…</w:t>
+      </w:r>
+      <w:r>
+        <w:t>………………………………..</w:t>
+      </w:r>
     </w:p>
     <w:p>
       <w:pPr>
@@ -3403,104 +2889,74 @@
         <w:spacing w:before="129" w:line="252" w:lineRule="exact"/>
       </w:pPr>
       <w:r>
-        <w:t xml:space="preserve">The </w:t>
-      </w:r>
-      <w:proofErr w:type="gramStart"/>
-      <w:r>
-        <w:t xml:space="preserve">ownership  </w:t>
+        <w:t xml:space="preserve">The ownership  </w:t>
       </w:r>
       <w:r>
         <w:rPr>
           <w:spacing w:val="-5"/>
         </w:rPr>
+        <w:t xml:space="preserve">of  </w:t>
+      </w:r>
+      <w:r>
+        <w:t xml:space="preserve">the vehicle  </w:t>
+      </w:r>
+      <w:r>
+        <w:rPr>
+          <w:spacing w:val="-2"/>
+        </w:rPr>
+        <w:t xml:space="preserve">has  </w:t>
+      </w:r>
+      <w:r>
+        <w:t xml:space="preserve">been transferred </w:t>
+      </w:r>
+      <w:r>
+        <w:rPr>
+          <w:spacing w:val="4"/>
+        </w:rPr>
+        <w:t xml:space="preserve">to </w:t>
+      </w:r>
+      <w:r>
+        <w:t>the</w:t>
+      </w:r>
+      <w:r>
+        <w:rPr>
+          <w:spacing w:val="-24"/>
+        </w:rPr>
+        <w:t xml:space="preserve"> </w:t>
+      </w:r>
+      <w:r>
+        <w:rPr>
+          <w:spacing w:val="-3"/>
+        </w:rPr>
+        <w:t>name</w:t>
+      </w:r>
+      <w:r>
+        <w:rPr>
+          <w:spacing w:val="22"/>
+        </w:rPr>
+        <w:t xml:space="preserve"> </w:t>
+      </w:r>
+      <w:r>
+        <w:rPr>
+          <w:spacing w:val="-3"/>
+        </w:rPr>
         <w:t>of</w:t>
       </w:r>
-      <w:proofErr w:type="gramEnd"/>
-      <w:r>
-        <w:rPr>
-          <w:spacing w:val="-5"/>
-        </w:rPr>
-        <w:t xml:space="preserve">  </w:t>
-      </w:r>
-      <w:r>
-        <w:t xml:space="preserve">the </w:t>
-      </w:r>
-      <w:proofErr w:type="gramStart"/>
-      <w:r>
-        <w:t xml:space="preserve">vehicle  </w:t>
-      </w:r>
-      <w:r>
-        <w:rPr>
-          <w:spacing w:val="-2"/>
-        </w:rPr>
-        <w:t>has</w:t>
-      </w:r>
-      <w:proofErr w:type="gramEnd"/>
-      <w:r>
-        <w:rPr>
-          <w:spacing w:val="-2"/>
-        </w:rPr>
-        <w:t xml:space="preserve">  </w:t>
-      </w:r>
-      <w:r>
-        <w:t xml:space="preserve">been transferred </w:t>
-      </w:r>
-      <w:r>
-        <w:rPr>
-          <w:spacing w:val="4"/>
-        </w:rPr>
-        <w:t xml:space="preserve">to </w:t>
-      </w:r>
-      <w:r>
-        <w:t>the</w:t>
-      </w:r>
-      <w:r>
-        <w:rPr>
-          <w:spacing w:val="-24"/>
-        </w:rPr>
-        <w:t xml:space="preserve"> </w:t>
-      </w:r>
-      <w:r>
-        <w:rPr>
-          <w:spacing w:val="-3"/>
-        </w:rPr>
-        <w:t>name</w:t>
-      </w:r>
-      <w:r>
-        <w:rPr>
-          <w:spacing w:val="22"/>
-        </w:rPr>
-        <w:t xml:space="preserve"> </w:t>
-      </w:r>
-      <w:r>
-        <w:rPr>
-          <w:spacing w:val="-3"/>
-        </w:rPr>
-        <w:t>of</w:t>
-      </w:r>
-      <w:r>
-        <w:rPr>
-          <w:spacing w:val="-3"/>
-        </w:rPr>
-        <w:tab/>
-      </w:r>
-      <w:r>
-        <w:rPr>
-          <w:spacing w:val="-3"/>
-        </w:rPr>
-        <w:t>………</w:t>
-      </w:r>
-      <w:proofErr w:type="gramStart"/>
-      <w:r>
-        <w:rPr>
-          <w:spacing w:val="-3"/>
-        </w:rPr>
-        <w:t>….</w:t>
+      <w:r>
+        <w:rPr>
+          <w:spacing w:val="-3"/>
+        </w:rPr>
+        <w:tab/>
+      </w:r>
+      <w:r>
+        <w:rPr>
+          <w:spacing w:val="-3"/>
+        </w:rPr>
+        <w:t>………….</w:t>
       </w:r>
       <w:r>
         <w:t>with</w:t>
       </w:r>
-      <w:proofErr w:type="gramEnd"/>
     </w:p>
     <w:p>
       <w:pPr>
@@ -3718,13 +3174,8 @@
         <w:t>The Transferor……………………</w:t>
       </w:r>
       <w:r>
-        <w:t>…………</w:t>
-      </w:r>
-      <w:proofErr w:type="gramStart"/>
-      <w:r>
-        <w:t>…..</w:t>
-      </w:r>
-      <w:proofErr w:type="gramEnd"/>
+        <w:t>……………..</w:t>
+      </w:r>
       <w:r>
         <w:t>……………………………………………………………………………….</w:t>
       </w:r>
@@ -3897,14 +3348,7 @@
         <w:rPr>
           <w:spacing w:val="-3"/>
         </w:rPr>
-        <w:t>Son/Wife/</w:t>
-      </w:r>
-      <w:proofErr w:type="gramStart"/>
-      <w:r>
-        <w:rPr>
-          <w:spacing w:val="-3"/>
-        </w:rPr>
-        <w:t xml:space="preserve">Daughter </w:t>
+        <w:t xml:space="preserve">Son/Wife/Daughter </w:t>
       </w:r>
       <w:r>
         <w:rPr>
@@ -3916,43 +3360,20 @@
         <w:rPr>
           <w:spacing w:val="-3"/>
         </w:rPr>
-        <w:t>of</w:t>
-      </w:r>
-      <w:proofErr w:type="gramEnd"/>
-      <w:r>
-        <w:rPr>
-          <w:spacing w:val="-3"/>
-        </w:rPr>
-        <w:t>……………………………………………………………………</w:t>
-      </w:r>
-      <w:r>
-        <w:rPr>
-          <w:spacing w:val="-3"/>
-        </w:rPr>
-        <w:t>………………</w:t>
-      </w:r>
-      <w:proofErr w:type="gramStart"/>
-      <w:r>
-        <w:rPr>
-          <w:spacing w:val="-3"/>
-        </w:rPr>
-        <w:t>…..</w:t>
-      </w:r>
-      <w:proofErr w:type="gramEnd"/>
-      <w:r>
-        <w:rPr>
-          <w:spacing w:val="-3"/>
-        </w:rPr>
-        <w:t>………………</w:t>
-      </w:r>
-      <w:proofErr w:type="gramStart"/>
-      <w:r>
-        <w:rPr>
-          <w:spacing w:val="-3"/>
-        </w:rPr>
-        <w:t>…..</w:t>
-      </w:r>
-      <w:proofErr w:type="gramEnd"/>
+        <w:t>of……………………………………………………………………</w:t>
+      </w:r>
+      <w:r>
+        <w:rPr>
+          <w:spacing w:val="-3"/>
+        </w:rPr>
+        <w:t>…………………..</w:t>
+      </w:r>
+      <w:r>
+        <w:rPr>
+          <w:spacing w:val="-3"/>
+        </w:rPr>
+        <w:t>…………………..</w:t>
+      </w:r>
     </w:p>
     <w:p>
       <w:pPr>
@@ -3966,7 +3387,6 @@
         <w:pStyle w:val="BodyText"/>
         <w:spacing w:before="1"/>
       </w:pPr>
-      <w:proofErr w:type="gramStart"/>
       <w:r>
         <w:t xml:space="preserve">Full </w:t>
       </w:r>
@@ -3980,29 +3400,14 @@
         <w:rPr>
           <w:spacing w:val="-3"/>
         </w:rPr>
-        <w:t>Address</w:t>
-      </w:r>
-      <w:proofErr w:type="gramEnd"/>
-      <w:r>
-        <w:rPr>
-          <w:spacing w:val="-3"/>
-        </w:rPr>
-        <w:t>………………………………………………………………………………</w:t>
-      </w:r>
-      <w:r>
-        <w:rPr>
-          <w:spacing w:val="-3"/>
-        </w:rPr>
-        <w:t>………………</w:t>
-      </w:r>
-      <w:proofErr w:type="gramStart"/>
-      <w:r>
-        <w:rPr>
-          <w:spacing w:val="-3"/>
-        </w:rPr>
-        <w:t>…..</w:t>
-      </w:r>
-      <w:proofErr w:type="gramEnd"/>
+        <w:t>Address………………………………………………………………………………</w:t>
+      </w:r>
+      <w:r>
+        <w:rPr>
+          <w:spacing w:val="-3"/>
+        </w:rPr>
+        <w:t>…………………..</w:t>
+      </w:r>
       <w:r>
         <w:rPr>
           <w:spacing w:val="-3"/>
@@ -4278,113 +3683,83 @@
         </w:rPr>
         <w:t xml:space="preserve"> </w:t>
       </w:r>
-      <w:proofErr w:type="gramStart"/>
-      <w:r>
-        <w:rPr>
-          <w:spacing w:val="-3"/>
-        </w:rPr>
-        <w:t>Shri./</w:t>
-      </w:r>
-      <w:proofErr w:type="gramEnd"/>
-      <w:r>
-        <w:rPr>
-          <w:spacing w:val="-3"/>
-        </w:rPr>
-        <w:t>Smt</w:t>
-      </w:r>
-      <w:r>
-        <w:rPr>
-          <w:spacing w:val="-3"/>
-        </w:rPr>
-        <w:t>.....................................................…</w:t>
-      </w:r>
-      <w:proofErr w:type="gramStart"/>
-      <w:r>
-        <w:rPr>
-          <w:spacing w:val="-3"/>
-        </w:rPr>
+      <w:r>
+        <w:rPr>
+          <w:spacing w:val="-3"/>
+        </w:rPr>
+        <w:t>Shri./Smt</w:t>
+      </w:r>
+      <w:r>
+        <w:rPr>
+          <w:spacing w:val="-3"/>
+        </w:rPr>
+        <w:t>.....................................................…….</w:t>
+      </w:r>
+      <w:r>
+        <w:rPr>
+          <w:spacing w:val="-3"/>
+        </w:rPr>
+        <w:t>Son/Wife/Daughter</w:t>
+      </w:r>
+    </w:p>
+    <w:p>
+      <w:pPr>
+        <w:pStyle w:val="BodyText"/>
+        <w:spacing w:before="124"/>
+      </w:pPr>
+      <w:r>
+        <w:rPr>
+          <w:spacing w:val="-3"/>
+        </w:rPr>
+        <w:t xml:space="preserve">of ……………………………………………………………… </w:t>
+      </w:r>
+      <w:r>
+        <w:t>residing</w:t>
+      </w:r>
+      <w:r>
+        <w:rPr>
+          <w:spacing w:val="15"/>
+        </w:rPr>
+        <w:t xml:space="preserve"> </w:t>
+      </w:r>
+      <w:r>
+        <w:t>at………</w:t>
+      </w:r>
+      <w:r>
+        <w:t>…………………</w:t>
+      </w:r>
+      <w:r>
+        <w:t>…………………………</w:t>
+      </w:r>
+    </w:p>
+    <w:p>
+      <w:pPr>
+        <w:pStyle w:val="BodyText"/>
+        <w:spacing w:before="136"/>
+      </w:pPr>
+      <w:r>
+        <w:t>…………………………………………………………………………………………………</w:t>
+      </w:r>
+      <w:r>
+        <w:t>………………….</w:t>
+      </w:r>
+      <w:r>
+        <w:t>……………</w:t>
+      </w:r>
+    </w:p>
+    <w:p>
+      <w:pPr>
+        <w:pStyle w:val="BodyText"/>
+        <w:spacing w:before="124" w:line="357" w:lineRule="auto"/>
+      </w:pPr>
+      <w:r>
+        <w:t>…………………………………………………………………………………</w:t>
+      </w:r>
+      <w:r>
         <w:t>….</w:t>
       </w:r>
       <w:r>
-        <w:rPr>
-          <w:spacing w:val="-3"/>
-        </w:rPr>
-        <w:t>Son</w:t>
-      </w:r>
-      <w:proofErr w:type="gramEnd"/>
-      <w:r>
-        <w:rPr>
-          <w:spacing w:val="-3"/>
-        </w:rPr>
-        <w:t>/Wife/Daughter</w:t>
-      </w:r>
-    </w:p>
-    <w:p>
-      <w:pPr>
-        <w:pStyle w:val="BodyText"/>
-        <w:spacing w:before="124"/>
-      </w:pPr>
-      <w:r>
-        <w:rPr>
-          <w:spacing w:val="-3"/>
-        </w:rPr>
-        <w:t xml:space="preserve">of ……………………………………………………………… </w:t>
-      </w:r>
-      <w:r>
-        <w:t>residing</w:t>
-      </w:r>
-      <w:r>
-        <w:rPr>
-          <w:spacing w:val="15"/>
-        </w:rPr>
-        <w:t xml:space="preserve"> </w:t>
-      </w:r>
-      <w:r>
-        <w:t>at………</w:t>
-      </w:r>
-      <w:r>
-        <w:t>…………………</w:t>
-      </w:r>
-      <w:r>
-        <w:t>…………………………</w:t>
-      </w:r>
-    </w:p>
-    <w:p>
-      <w:pPr>
-        <w:pStyle w:val="BodyText"/>
-        <w:spacing w:before="136"/>
-      </w:pPr>
-      <w:r>
-        <w:t>…………………………………………………………………………………………………</w:t>
-      </w:r>
-      <w:r>
-        <w:t>………………….</w:t>
-      </w:r>
-      <w:r>
-        <w:t>……………</w:t>
-      </w:r>
-    </w:p>
-    <w:p>
-      <w:pPr>
-        <w:pStyle w:val="BodyText"/>
-        <w:spacing w:before="124" w:line="357" w:lineRule="auto"/>
-      </w:pPr>
-      <w:r>
-        <w:t>…………………………………………………………………………………</w:t>
-      </w:r>
-      <w:r>
-        <w:t>….</w:t>
-      </w:r>
-      <w:r>
-        <w:t>……</w:t>
-      </w:r>
-      <w:proofErr w:type="gramStart"/>
-      <w:r>
-        <w:t>…..</w:t>
-      </w:r>
-      <w:proofErr w:type="gramEnd"/>
-      <w:r>
-        <w:t>(full address) and handed over the Certificate of Registration and the Certificate of Insurance to him/her/them.</w:t>
+        <w:t>………..(full address) and handed over the Certificate of Registration and the Certificate of Insurance to him/her/them.</w:t>
       </w:r>
     </w:p>
     <w:p>
@@ -4447,13 +3822,8 @@
         <w:t>Date………………</w:t>
       </w:r>
       <w:r>
-        <w:t>…</w:t>
-      </w:r>
-      <w:proofErr w:type="gramStart"/>
-      <w:r>
-        <w:t>…..</w:t>
-      </w:r>
-      <w:proofErr w:type="gramEnd"/>
+        <w:t>……..</w:t>
+      </w:r>
       <w:r>
         <w:t>………</w:t>
       </w:r>
@@ -4717,15 +4087,7 @@
         <w:ind w:left="118"/>
       </w:pPr>
       <w:r>
-        <w:t>………………………………………………………………………</w:t>
-      </w:r>
-      <w:proofErr w:type="gramStart"/>
-      <w:r>
-        <w:t>….(</w:t>
-      </w:r>
-      <w:proofErr w:type="gramEnd"/>
-      <w:r>
-        <w:t>Proof of address to be enclosed).</w:t>
+        <w:t>………………………………………………………………………….(Proof of address to be enclosed).</w:t>
       </w:r>
     </w:p>
     <w:p>
@@ -4736,38 +4098,16 @@
         <w:jc w:val="right"/>
       </w:pPr>
       <w:r>
-        <w:t xml:space="preserve">I/We hereby declare </w:t>
-      </w:r>
-      <w:proofErr w:type="gramStart"/>
-      <w:r>
-        <w:t xml:space="preserve">that  </w:t>
-      </w:r>
-      <w:r>
-        <w:rPr>
-          <w:spacing w:val="-3"/>
-        </w:rPr>
-        <w:t>I</w:t>
-      </w:r>
-      <w:proofErr w:type="gramEnd"/>
-      <w:r>
-        <w:rPr>
-          <w:spacing w:val="-3"/>
-        </w:rPr>
-        <w:t>/</w:t>
-      </w:r>
-      <w:proofErr w:type="gramStart"/>
-      <w:r>
-        <w:rPr>
-          <w:spacing w:val="-3"/>
-        </w:rPr>
-        <w:t xml:space="preserve">We  </w:t>
-      </w:r>
-      <w:r>
-        <w:t>have</w:t>
-      </w:r>
-      <w:proofErr w:type="gramEnd"/>
-      <w:r>
-        <w:t xml:space="preserve"> on this…………………day </w:t>
+        <w:t xml:space="preserve">I/We hereby declare that  </w:t>
+      </w:r>
+      <w:r>
+        <w:rPr>
+          <w:spacing w:val="-3"/>
+        </w:rPr>
+        <w:t xml:space="preserve">I/We  </w:t>
+      </w:r>
+      <w:r>
+        <w:t xml:space="preserve">have on this…………………day </w:t>
       </w:r>
       <w:r>
         <w:rPr>
@@ -4794,13 +4134,8 @@
         <w:t>year………………………………</w:t>
       </w:r>
       <w:r>
-        <w:t>…</w:t>
-      </w:r>
-      <w:proofErr w:type="gramStart"/>
-      <w:r>
-        <w:t>…..</w:t>
-      </w:r>
-      <w:proofErr w:type="gramEnd"/>
+        <w:t>……..</w:t>
+      </w:r>
     </w:p>
     <w:p>
       <w:pPr>
@@ -4870,16 +4205,11 @@
         <w:t>number……………………………</w:t>
       </w:r>
       <w:r>
-        <w:t>…………………</w:t>
-      </w:r>
-      <w:proofErr w:type="gramStart"/>
-      <w:r>
-        <w:t>…</w:t>
+        <w:t>……………………</w:t>
       </w:r>
       <w:r>
         <w:t>..</w:t>
       </w:r>
-      <w:proofErr w:type="gramEnd"/>
       <w:r>
         <w:rPr>
           <w:spacing w:val="31"/>
@@ -4908,21 +4238,11 @@
         <w:t>from…………………………………………………………………………………………………</w:t>
       </w:r>
       <w:r>
-        <w:t>………………</w:t>
-      </w:r>
-      <w:proofErr w:type="gramStart"/>
-      <w:r>
-        <w:t>…..</w:t>
-      </w:r>
-      <w:proofErr w:type="gramEnd"/>
-      <w:r>
-        <w:t>……</w:t>
-      </w:r>
-      <w:proofErr w:type="gramStart"/>
-      <w:r>
-        <w:t>…..</w:t>
-      </w:r>
-      <w:proofErr w:type="gramEnd"/>
+        <w:t>…………………..</w:t>
+      </w:r>
+      <w:r>
+        <w:t>………..</w:t>
+      </w:r>
     </w:p>
     <w:p>
       <w:pPr>
@@ -4949,13 +4269,8 @@
       <w:r>
         <w:t>…………………………………………………………</w:t>
       </w:r>
-      <w:proofErr w:type="gramStart"/>
-      <w:r>
-        <w:t>…(</w:t>
-      </w:r>
-      <w:proofErr w:type="gramEnd"/>
-      <w:r>
-        <w:t>name and full address) and request that necessary entries regarding the transfer of ownership of the vehicle in my/our name may be recorded in the certificate of registration and certificate of fitness of the vehicle, which is enclosed.</w:t>
+      <w:r>
+        <w:t>…(name and full address) and request that necessary entries regarding the transfer of ownership of the vehicle in my/our name may be recorded in the certificate of registration and certificate of fitness of the vehicle, which is enclosed.</w:t>
       </w:r>
     </w:p>
     <w:p>
@@ -5007,13 +4322,8 @@
         </w:rPr>
         <w:t xml:space="preserve">I/We </w:t>
       </w:r>
-      <w:proofErr w:type="gramStart"/>
-      <w:r>
-        <w:t>have  not</w:t>
-      </w:r>
-      <w:proofErr w:type="gramEnd"/>
-      <w:r>
-        <w:t xml:space="preserve"> suppressed any facts </w:t>
+      <w:r>
+        <w:t xml:space="preserve">have  not suppressed any facts </w:t>
       </w:r>
       <w:r>
         <w:rPr>
@@ -5036,13 +4346,8 @@
         </w:rPr>
         <w:t xml:space="preserve">not </w:t>
       </w:r>
-      <w:proofErr w:type="spellStart"/>
-      <w:r>
-        <w:t>superdari</w:t>
-      </w:r>
-      <w:proofErr w:type="spellEnd"/>
-      <w:r>
-        <w:t xml:space="preserve"> and free from all encumbrances. </w:t>
+      <w:r>
+        <w:t xml:space="preserve">superdari and free from all encumbrances. </w:t>
       </w:r>
       <w:r>
         <w:rPr>
@@ -5372,7 +4677,6 @@
         </w:rPr>
         <w:t xml:space="preserve">I/We being a party to an agreement of hire-purchase/lease/hypothecation in respect of </w:t>
       </w:r>
-      <w:proofErr w:type="gramStart"/>
       <w:r>
         <w:rPr>
           <w:spacing w:val="-3"/>
@@ -5384,16 +4688,8 @@
         <w:rPr>
           <w:sz w:val="20"/>
         </w:rPr>
-        <w:t>vehicle</w:t>
-      </w:r>
-      <w:proofErr w:type="gramEnd"/>
-      <w:r>
-        <w:rPr>
-          <w:sz w:val="20"/>
-        </w:rPr>
-        <w:t xml:space="preserve">  </w:t>
-      </w:r>
-      <w:proofErr w:type="gramStart"/>
+        <w:t xml:space="preserve">vehicle  </w:t>
+      </w:r>
       <w:r>
         <w:rPr>
           <w:spacing w:val="-4"/>
@@ -5406,15 +4702,7 @@
           <w:spacing w:val="-3"/>
           <w:sz w:val="20"/>
         </w:rPr>
-        <w:t>above</w:t>
-      </w:r>
-      <w:proofErr w:type="gramEnd"/>
-      <w:r>
-        <w:rPr>
-          <w:spacing w:val="-3"/>
-          <w:sz w:val="20"/>
-        </w:rPr>
-        <w:t xml:space="preserve">, give </w:t>
+        <w:t xml:space="preserve">above, give </w:t>
       </w:r>
       <w:r>
         <w:rPr>
@@ -5446,21 +4734,7 @@
         <w:rPr>
           <w:sz w:val="20"/>
         </w:rPr>
-        <w:t xml:space="preserve">vehicle in </w:t>
-      </w:r>
-      <w:proofErr w:type="gramStart"/>
-      <w:r>
-        <w:rPr>
-          <w:sz w:val="20"/>
-        </w:rPr>
-        <w:t>the  name</w:t>
-      </w:r>
-      <w:proofErr w:type="gramEnd"/>
-      <w:r>
-        <w:rPr>
-          <w:sz w:val="20"/>
-        </w:rPr>
-        <w:t xml:space="preserve">  of the Transferee named </w:t>
+        <w:t xml:space="preserve">vehicle in the  name  of the Transferee named </w:t>
       </w:r>
       <w:r>
         <w:rPr>
@@ -5713,19 +4987,11 @@
           <w:sz w:val="20"/>
         </w:rPr>
       </w:pPr>
-      <w:proofErr w:type="spellStart"/>
-      <w:r>
-        <w:rPr>
-          <w:sz w:val="20"/>
-        </w:rPr>
-        <w:t>Ref.No</w:t>
-      </w:r>
-      <w:proofErr w:type="spellEnd"/>
-      <w:r>
-        <w:rPr>
-          <w:sz w:val="20"/>
-        </w:rPr>
-        <w:t>……………………</w:t>
+      <w:r>
+        <w:rPr>
+          <w:sz w:val="20"/>
+        </w:rPr>
+        <w:t>Ref.No……………………</w:t>
       </w:r>
       <w:r>
         <w:rPr>
@@ -5761,16 +5027,8 @@
         <w:rPr>
           <w:sz w:val="20"/>
         </w:rPr>
-        <w:t>……………………………………</w:t>
-      </w:r>
-      <w:proofErr w:type="gramStart"/>
-      <w:r>
-        <w:rPr>
-          <w:sz w:val="20"/>
-        </w:rPr>
-        <w:t>…..</w:t>
-      </w:r>
-      <w:proofErr w:type="gramEnd"/>
+        <w:t>………………………………………..</w:t>
+      </w:r>
     </w:p>
     <w:p>
       <w:pPr>
@@ -6037,14 +5295,12 @@
         </w:rPr>
         <w:t>……………………</w:t>
       </w:r>
-      <w:proofErr w:type="gramStart"/>
       <w:r>
         <w:rPr>
           <w:sz w:val="20"/>
         </w:rPr>
         <w:t>…..</w:t>
       </w:r>
-      <w:proofErr w:type="gramEnd"/>
       <w:r>
         <w:rPr>
           <w:sz w:val="20"/>
@@ -6328,14 +5584,12 @@
         </w:rPr>
         <w:t>………………</w:t>
       </w:r>
-      <w:proofErr w:type="gramStart"/>
       <w:r>
         <w:rPr>
           <w:sz w:val="20"/>
         </w:rPr>
         <w:t>…..</w:t>
       </w:r>
-      <w:proofErr w:type="gramEnd"/>
       <w:r>
         <w:rPr>
           <w:sz w:val="20"/>
@@ -6413,16 +5667,8 @@
         <w:rPr>
           <w:sz w:val="20"/>
         </w:rPr>
-        <w:t>……………………………</w:t>
-      </w:r>
-      <w:proofErr w:type="gramStart"/>
-      <w:r>
-        <w:rPr>
-          <w:sz w:val="20"/>
-        </w:rPr>
-        <w:t>…..</w:t>
-      </w:r>
-      <w:proofErr w:type="gramEnd"/>
+        <w:t>………………………………..</w:t>
+      </w:r>
       <w:r>
         <w:rPr>
           <w:sz w:val="20"/>

</xml_diff>